<commit_message>
chore: regenerate example output files after style ID rename
</commit_message>
<xml_diff>
--- a/examples/01-blank-doc/output.docx
+++ b/examples/01-blank-doc/output.docx
@@ -413,15 +413,15 @@
     <w:lsdException w:name="Smart Hyperlink" w:semiHidden="1" w:unhideWhenUsed="1"/>
     <w:lsdException w:name="Smart Link" w:semiHidden="1" w:unhideWhenUsed="1"/>
   </w:latentStyles>
-  <w:style w:type="paragraph" w:default="1" w:styleId="Normale">
+  <w:style w:type="paragraph" w:default="1" w:styleId="Normal">
     <w:name w:val="Normal"/>
     <w:qFormat/>
   </w:style>
-  <w:style w:type="paragraph" w:styleId="Titolo1">
+  <w:style w:type="paragraph" w:styleId="Heading1">
     <w:name w:val="heading 1"/>
-    <w:basedOn w:val="Normale"/>
-    <w:next w:val="Normale"/>
-    <w:link w:val="Titolo1Carattere"/>
+    <w:basedOn w:val="Normal"/>
+    <w:next w:val="Normal"/>
+    <w:link w:val="Heading1Char"/>
     <w:uiPriority w:val="9"/>
     <w:qFormat/>
     <w:rsid w:val="001573D8"/>
@@ -438,11 +438,11 @@
       <w:szCs w:val="40"/>
     </w:rPr>
   </w:style>
-  <w:style w:type="paragraph" w:styleId="Titolo2">
+  <w:style w:type="paragraph" w:styleId="Heading2">
     <w:name w:val="heading 2"/>
-    <w:basedOn w:val="Normale"/>
-    <w:next w:val="Normale"/>
-    <w:link w:val="Titolo2Carattere"/>
+    <w:basedOn w:val="Normal"/>
+    <w:next w:val="Normal"/>
+    <w:link w:val="Heading2Char"/>
     <w:uiPriority w:val="9"/>
     <w:semiHidden/>
     <w:unhideWhenUsed/>
@@ -461,11 +461,11 @@
       <w:szCs w:val="32"/>
     </w:rPr>
   </w:style>
-  <w:style w:type="paragraph" w:styleId="Titolo3">
+  <w:style w:type="paragraph" w:styleId="Heading3">
     <w:name w:val="heading 3"/>
-    <w:basedOn w:val="Normale"/>
-    <w:next w:val="Normale"/>
-    <w:link w:val="Titolo3Carattere"/>
+    <w:basedOn w:val="Normal"/>
+    <w:next w:val="Normal"/>
+    <w:link w:val="Heading3Char"/>
     <w:uiPriority w:val="9"/>
     <w:semiHidden/>
     <w:unhideWhenUsed/>
@@ -484,11 +484,11 @@
       <w:szCs w:val="28"/>
     </w:rPr>
   </w:style>
-  <w:style w:type="paragraph" w:styleId="Titolo4">
+  <w:style w:type="paragraph" w:styleId="Heading4">
     <w:name w:val="heading 4"/>
-    <w:basedOn w:val="Normale"/>
-    <w:next w:val="Normale"/>
-    <w:link w:val="Titolo4Carattere"/>
+    <w:basedOn w:val="Normal"/>
+    <w:next w:val="Normal"/>
+    <w:link w:val="Heading4Char"/>
     <w:uiPriority w:val="9"/>
     <w:semiHidden/>
     <w:unhideWhenUsed/>
@@ -507,11 +507,11 @@
       <w:color w:val="0F4761" w:themeColor="accent1" w:themeShade="BF"/>
     </w:rPr>
   </w:style>
-  <w:style w:type="paragraph" w:styleId="Titolo5">
+  <w:style w:type="paragraph" w:styleId="Heading5">
     <w:name w:val="heading 5"/>
-    <w:basedOn w:val="Normale"/>
-    <w:next w:val="Normale"/>
-    <w:link w:val="Titolo5Carattere"/>
+    <w:basedOn w:val="Normal"/>
+    <w:next w:val="Normal"/>
+    <w:link w:val="Heading5Char"/>
     <w:uiPriority w:val="9"/>
     <w:semiHidden/>
     <w:unhideWhenUsed/>
@@ -528,11 +528,11 @@
       <w:color w:val="0F4761" w:themeColor="accent1" w:themeShade="BF"/>
     </w:rPr>
   </w:style>
-  <w:style w:type="paragraph" w:styleId="Titolo6">
+  <w:style w:type="paragraph" w:styleId="Heading6">
     <w:name w:val="heading 6"/>
-    <w:basedOn w:val="Normale"/>
-    <w:next w:val="Normale"/>
-    <w:link w:val="Titolo6Carattere"/>
+    <w:basedOn w:val="Normal"/>
+    <w:next w:val="Normal"/>
+    <w:link w:val="Heading6Char"/>
     <w:uiPriority w:val="9"/>
     <w:semiHidden/>
     <w:unhideWhenUsed/>
@@ -551,11 +551,11 @@
       <w:color w:val="595959" w:themeColor="text1" w:themeTint="A6"/>
     </w:rPr>
   </w:style>
-  <w:style w:type="paragraph" w:styleId="Titolo7">
+  <w:style w:type="paragraph" w:styleId="Heading7">
     <w:name w:val="heading 7"/>
-    <w:basedOn w:val="Normale"/>
-    <w:next w:val="Normale"/>
-    <w:link w:val="Titolo7Carattere"/>
+    <w:basedOn w:val="Normal"/>
+    <w:next w:val="Normal"/>
+    <w:link w:val="Heading7Char"/>
     <w:uiPriority w:val="9"/>
     <w:semiHidden/>
     <w:unhideWhenUsed/>
@@ -572,11 +572,11 @@
       <w:color w:val="595959" w:themeColor="text1" w:themeTint="A6"/>
     </w:rPr>
   </w:style>
-  <w:style w:type="paragraph" w:styleId="Titolo8">
+  <w:style w:type="paragraph" w:styleId="Heading8">
     <w:name w:val="heading 8"/>
-    <w:basedOn w:val="Normale"/>
-    <w:next w:val="Normale"/>
-    <w:link w:val="Titolo8Carattere"/>
+    <w:basedOn w:val="Normal"/>
+    <w:next w:val="Normal"/>
+    <w:link w:val="Heading8Char"/>
     <w:uiPriority w:val="9"/>
     <w:semiHidden/>
     <w:unhideWhenUsed/>
@@ -594,11 +594,11 @@
       <w:color w:val="272727" w:themeColor="text1" w:themeTint="D8"/>
     </w:rPr>
   </w:style>
-  <w:style w:type="paragraph" w:styleId="Titolo9">
+  <w:style w:type="paragraph" w:styleId="Heading9">
     <w:name w:val="heading 9"/>
-    <w:basedOn w:val="Normale"/>
-    <w:next w:val="Normale"/>
-    <w:link w:val="Titolo9Carattere"/>
+    <w:basedOn w:val="Normal"/>
+    <w:next w:val="Normal"/>
+    <w:link w:val="Heading9Char"/>
     <w:uiPriority w:val="9"/>
     <w:semiHidden/>
     <w:unhideWhenUsed/>
@@ -614,13 +614,13 @@
       <w:color w:val="272727" w:themeColor="text1" w:themeTint="D8"/>
     </w:rPr>
   </w:style>
-  <w:style w:type="character" w:default="1" w:styleId="Carpredefinitoparagrafo">
+  <w:style w:type="character" w:default="1" w:styleId="DefaultParagraphFont">
     <w:name w:val="Default Paragraph Font"/>
     <w:uiPriority w:val="1"/>
     <w:semiHidden/>
     <w:unhideWhenUsed/>
   </w:style>
-  <w:style w:type="table" w:default="1" w:styleId="Tabellanormale">
+  <w:style w:type="table" w:default="1" w:styleId="TableNormal">
     <w:name w:val="Normal Table"/>
     <w:uiPriority w:val="99"/>
     <w:semiHidden/>
@@ -635,16 +635,16 @@
       </w:tblCellMar>
     </w:tblPr>
   </w:style>
-  <w:style w:type="numbering" w:default="1" w:styleId="Nessunelenco">
+  <w:style w:type="numbering" w:default="1" w:styleId="NoList">
     <w:name w:val="No List"/>
     <w:uiPriority w:val="99"/>
     <w:semiHidden/>
     <w:unhideWhenUsed/>
   </w:style>
-  <w:style w:type="character" w:customStyle="1" w:styleId="Titolo1Carattere">
+  <w:style w:type="character" w:customStyle="1" w:styleId="Heading1Char">
     <w:name w:val="Titolo 1 Carattere"/>
-    <w:basedOn w:val="Carpredefinitoparagrafo"/>
-    <w:link w:val="Titolo1"/>
+    <w:basedOn w:val="DefaultParagraphFont"/>
+    <w:link w:val="Heading1"/>
     <w:uiPriority w:val="9"/>
     <w:rsid w:val="001573D8"/>
     <w:rPr>
@@ -654,10 +654,10 @@
       <w:szCs w:val="40"/>
     </w:rPr>
   </w:style>
-  <w:style w:type="character" w:customStyle="1" w:styleId="Titolo2Carattere">
+  <w:style w:type="character" w:customStyle="1" w:styleId="Heading2Char">
     <w:name w:val="Titolo 2 Carattere"/>
-    <w:basedOn w:val="Carpredefinitoparagrafo"/>
-    <w:link w:val="Titolo2"/>
+    <w:basedOn w:val="DefaultParagraphFont"/>
+    <w:link w:val="Heading2"/>
     <w:uiPriority w:val="9"/>
     <w:semiHidden/>
     <w:rsid w:val="001573D8"/>
@@ -668,10 +668,10 @@
       <w:szCs w:val="32"/>
     </w:rPr>
   </w:style>
-  <w:style w:type="character" w:customStyle="1" w:styleId="Titolo3Carattere">
+  <w:style w:type="character" w:customStyle="1" w:styleId="Heading3Char">
     <w:name w:val="Titolo 3 Carattere"/>
-    <w:basedOn w:val="Carpredefinitoparagrafo"/>
-    <w:link w:val="Titolo3"/>
+    <w:basedOn w:val="DefaultParagraphFont"/>
+    <w:link w:val="Heading3"/>
     <w:uiPriority w:val="9"/>
     <w:semiHidden/>
     <w:rsid w:val="001573D8"/>
@@ -682,10 +682,10 @@
       <w:szCs w:val="28"/>
     </w:rPr>
   </w:style>
-  <w:style w:type="character" w:customStyle="1" w:styleId="Titolo4Carattere">
+  <w:style w:type="character" w:customStyle="1" w:styleId="Heading4Char">
     <w:name w:val="Titolo 4 Carattere"/>
-    <w:basedOn w:val="Carpredefinitoparagrafo"/>
-    <w:link w:val="Titolo4"/>
+    <w:basedOn w:val="DefaultParagraphFont"/>
+    <w:link w:val="Heading4"/>
     <w:uiPriority w:val="9"/>
     <w:semiHidden/>
     <w:rsid w:val="001573D8"/>
@@ -696,22 +696,22 @@
       <w:color w:val="0F4761" w:themeColor="accent1" w:themeShade="BF"/>
     </w:rPr>
   </w:style>
-  <w:style w:type="character" w:customStyle="1" w:styleId="Titolo5Carattere">
+  <w:style w:type="character" w:customStyle="1" w:styleId="Heading5Char">
     <w:name w:val="Titolo 5 Carattere"/>
-    <w:basedOn w:val="Carpredefinitoparagrafo"/>
-    <w:link w:val="Titolo5"/>
-    <w:uiPriority w:val="9"/>
-    <w:semiHidden/>
-    <w:rsid w:val="001573D8"/>
-    <w:rPr>
-      <w:rFonts w:eastAsiaTheme="majorEastAsia" w:cstheme="majorBidi"/>
-      <w:color w:val="0F4761" w:themeColor="accent1" w:themeShade="BF"/>
-    </w:rPr>
-  </w:style>
-  <w:style w:type="character" w:customStyle="1" w:styleId="Titolo6Carattere">
+    <w:basedOn w:val="DefaultParagraphFont"/>
+    <w:link w:val="Heading5"/>
+    <w:uiPriority w:val="9"/>
+    <w:semiHidden/>
+    <w:rsid w:val="001573D8"/>
+    <w:rPr>
+      <w:rFonts w:eastAsiaTheme="majorEastAsia" w:cstheme="majorBidi"/>
+      <w:color w:val="0F4761" w:themeColor="accent1" w:themeShade="BF"/>
+    </w:rPr>
+  </w:style>
+  <w:style w:type="character" w:customStyle="1" w:styleId="Heading6Char">
     <w:name w:val="Titolo 6 Carattere"/>
-    <w:basedOn w:val="Carpredefinitoparagrafo"/>
-    <w:link w:val="Titolo6"/>
+    <w:basedOn w:val="DefaultParagraphFont"/>
+    <w:link w:val="Heading6"/>
     <w:uiPriority w:val="9"/>
     <w:semiHidden/>
     <w:rsid w:val="001573D8"/>
@@ -722,10 +722,10 @@
       <w:color w:val="595959" w:themeColor="text1" w:themeTint="A6"/>
     </w:rPr>
   </w:style>
-  <w:style w:type="character" w:customStyle="1" w:styleId="Titolo7Carattere">
+  <w:style w:type="character" w:customStyle="1" w:styleId="Heading7Char">
     <w:name w:val="Titolo 7 Carattere"/>
-    <w:basedOn w:val="Carpredefinitoparagrafo"/>
-    <w:link w:val="Titolo7"/>
+    <w:basedOn w:val="DefaultParagraphFont"/>
+    <w:link w:val="Heading7"/>
     <w:uiPriority w:val="9"/>
     <w:semiHidden/>
     <w:rsid w:val="001573D8"/>
@@ -734,10 +734,10 @@
       <w:color w:val="595959" w:themeColor="text1" w:themeTint="A6"/>
     </w:rPr>
   </w:style>
-  <w:style w:type="character" w:customStyle="1" w:styleId="Titolo8Carattere">
+  <w:style w:type="character" w:customStyle="1" w:styleId="Heading8Char">
     <w:name w:val="Titolo 8 Carattere"/>
-    <w:basedOn w:val="Carpredefinitoparagrafo"/>
-    <w:link w:val="Titolo8"/>
+    <w:basedOn w:val="DefaultParagraphFont"/>
+    <w:link w:val="Heading8"/>
     <w:uiPriority w:val="9"/>
     <w:semiHidden/>
     <w:rsid w:val="001573D8"/>
@@ -748,10 +748,10 @@
       <w:color w:val="272727" w:themeColor="text1" w:themeTint="D8"/>
     </w:rPr>
   </w:style>
-  <w:style w:type="character" w:customStyle="1" w:styleId="Titolo9Carattere">
+  <w:style w:type="character" w:customStyle="1" w:styleId="Heading9Char">
     <w:name w:val="Titolo 9 Carattere"/>
-    <w:basedOn w:val="Carpredefinitoparagrafo"/>
-    <w:link w:val="Titolo9"/>
+    <w:basedOn w:val="DefaultParagraphFont"/>
+    <w:link w:val="Heading9"/>
     <w:uiPriority w:val="9"/>
     <w:semiHidden/>
     <w:rsid w:val="001573D8"/>
@@ -760,11 +760,11 @@
       <w:color w:val="272727" w:themeColor="text1" w:themeTint="D8"/>
     </w:rPr>
   </w:style>
-  <w:style w:type="paragraph" w:styleId="Titolo">
+  <w:style w:type="paragraph" w:styleId="Title">
     <w:name w:val="Title"/>
-    <w:basedOn w:val="Normale"/>
-    <w:next w:val="Normale"/>
-    <w:link w:val="TitoloCarattere"/>
+    <w:basedOn w:val="Normal"/>
+    <w:next w:val="Normal"/>
+    <w:link w:val="TitleChar"/>
     <w:uiPriority w:val="10"/>
     <w:qFormat/>
     <w:rsid w:val="001573D8"/>
@@ -780,10 +780,10 @@
       <w:szCs w:val="56"/>
     </w:rPr>
   </w:style>
-  <w:style w:type="character" w:customStyle="1" w:styleId="TitoloCarattere">
+  <w:style w:type="character" w:customStyle="1" w:styleId="TitleChar">
     <w:name w:val="Titolo Carattere"/>
-    <w:basedOn w:val="Carpredefinitoparagrafo"/>
-    <w:link w:val="Titolo"/>
+    <w:basedOn w:val="DefaultParagraphFont"/>
+    <w:link w:val="Title"/>
     <w:uiPriority w:val="10"/>
     <w:rsid w:val="001573D8"/>
     <w:rPr>
@@ -794,11 +794,11 @@
       <w:szCs w:val="56"/>
     </w:rPr>
   </w:style>
-  <w:style w:type="paragraph" w:styleId="Sottotitolo">
+  <w:style w:type="paragraph" w:styleId="Subtitle">
     <w:name w:val="Subtitle"/>
-    <w:basedOn w:val="Normale"/>
-    <w:next w:val="Normale"/>
-    <w:link w:val="SottotitoloCarattere"/>
+    <w:basedOn w:val="Normal"/>
+    <w:next w:val="Normal"/>
+    <w:link w:val="SubtitleChar"/>
     <w:uiPriority w:val="11"/>
     <w:qFormat/>
     <w:rsid w:val="001573D8"/>
@@ -816,10 +816,10 @@
       <w:szCs w:val="28"/>
     </w:rPr>
   </w:style>
-  <w:style w:type="character" w:customStyle="1" w:styleId="SottotitoloCarattere">
+  <w:style w:type="character" w:customStyle="1" w:styleId="SubtitleChar">
     <w:name w:val="Sottotitolo Carattere"/>
-    <w:basedOn w:val="Carpredefinitoparagrafo"/>
-    <w:link w:val="Sottotitolo"/>
+    <w:basedOn w:val="DefaultParagraphFont"/>
+    <w:link w:val="Subtitle"/>
     <w:uiPriority w:val="11"/>
     <w:rsid w:val="001573D8"/>
     <w:rPr>
@@ -830,11 +830,11 @@
       <w:szCs w:val="28"/>
     </w:rPr>
   </w:style>
-  <w:style w:type="paragraph" w:styleId="Citazione">
+  <w:style w:type="paragraph" w:styleId="Quote">
     <w:name w:val="Quote"/>
-    <w:basedOn w:val="Normale"/>
-    <w:next w:val="Normale"/>
-    <w:link w:val="CitazioneCarattere"/>
+    <w:basedOn w:val="Normal"/>
+    <w:next w:val="Normal"/>
+    <w:link w:val="QuoteChar"/>
     <w:uiPriority w:val="29"/>
     <w:qFormat/>
     <w:rsid w:val="001573D8"/>
@@ -848,10 +848,10 @@
       <w:color w:val="404040" w:themeColor="text1" w:themeTint="BF"/>
     </w:rPr>
   </w:style>
-  <w:style w:type="character" w:customStyle="1" w:styleId="CitazioneCarattere">
+  <w:style w:type="character" w:customStyle="1" w:styleId="QuoteChar">
     <w:name w:val="Citazione Carattere"/>
-    <w:basedOn w:val="Carpredefinitoparagrafo"/>
-    <w:link w:val="Citazione"/>
+    <w:basedOn w:val="DefaultParagraphFont"/>
+    <w:link w:val="Quote"/>
     <w:uiPriority w:val="29"/>
     <w:rsid w:val="001573D8"/>
     <w:rPr>
@@ -860,9 +860,9 @@
       <w:color w:val="404040" w:themeColor="text1" w:themeTint="BF"/>
     </w:rPr>
   </w:style>
-  <w:style w:type="paragraph" w:styleId="Paragrafoelenco">
+  <w:style w:type="paragraph" w:styleId="ListParagraph">
     <w:name w:val="List Paragraph"/>
-    <w:basedOn w:val="Normale"/>
+    <w:basedOn w:val="Normal"/>
     <w:uiPriority w:val="34"/>
     <w:qFormat/>
     <w:rsid w:val="001573D8"/>
@@ -871,9 +871,9 @@
       <w:contextualSpacing/>
     </w:pPr>
   </w:style>
-  <w:style w:type="character" w:styleId="Enfasiintensa">
+  <w:style w:type="character" w:styleId="IntenseEmphasis">
     <w:name w:val="Intense Emphasis"/>
-    <w:basedOn w:val="Carpredefinitoparagrafo"/>
+    <w:basedOn w:val="DefaultParagraphFont"/>
     <w:uiPriority w:val="21"/>
     <w:qFormat/>
     <w:rsid w:val="001573D8"/>
@@ -883,11 +883,11 @@
       <w:color w:val="0F4761" w:themeColor="accent1" w:themeShade="BF"/>
     </w:rPr>
   </w:style>
-  <w:style w:type="paragraph" w:styleId="Citazioneintensa">
+  <w:style w:type="paragraph" w:styleId="IntenseQuote">
     <w:name w:val="Intense Quote"/>
-    <w:basedOn w:val="Normale"/>
-    <w:next w:val="Normale"/>
-    <w:link w:val="CitazioneintensaCarattere"/>
+    <w:basedOn w:val="Normal"/>
+    <w:next w:val="Normal"/>
+    <w:link w:val="IntenseQuoteChar"/>
     <w:uiPriority w:val="30"/>
     <w:qFormat/>
     <w:rsid w:val="001573D8"/>
@@ -906,10 +906,10 @@
       <w:color w:val="0F4761" w:themeColor="accent1" w:themeShade="BF"/>
     </w:rPr>
   </w:style>
-  <w:style w:type="character" w:customStyle="1" w:styleId="CitazioneintensaCarattere">
+  <w:style w:type="character" w:customStyle="1" w:styleId="IntenseQuoteChar">
     <w:name w:val="Citazione intensa Carattere"/>
-    <w:basedOn w:val="Carpredefinitoparagrafo"/>
-    <w:link w:val="Citazioneintensa"/>
+    <w:basedOn w:val="DefaultParagraphFont"/>
+    <w:link w:val="IntenseQuote"/>
     <w:uiPriority w:val="30"/>
     <w:rsid w:val="001573D8"/>
     <w:rPr>
@@ -918,9 +918,9 @@
       <w:color w:val="0F4761" w:themeColor="accent1" w:themeShade="BF"/>
     </w:rPr>
   </w:style>
-  <w:style w:type="character" w:styleId="Riferimentointenso">
+  <w:style w:type="character" w:styleId="IntenseReference">
     <w:name w:val="Intense Reference"/>
-    <w:basedOn w:val="Carpredefinitoparagrafo"/>
+    <w:basedOn w:val="DefaultParagraphFont"/>
     <w:uiPriority w:val="32"/>
     <w:qFormat/>
     <w:rsid w:val="001573D8"/>

</xml_diff>